<commit_message>
Update lab 3 and add overall report
</commit_message>
<xml_diff>
--- a/students/Agametov A. M/ОТЧЕТ.docx
+++ b/students/Agametov A. M/ОТЧЕТ.docx
@@ -334,7 +334,10 @@
       </w:sdtPr>
       <w:sdtEndPr>
         <w:rPr>
+          <w:rFonts w:ascii="Times New Roman" w:hAnsi="Times New Roman" w:cs="Times New Roman"/>
           <w:color w:val="auto"/>
+          <w:sz w:val="28"/>
+          <w:szCs w:val="28"/>
         </w:rPr>
       </w:sdtEndPr>
       <w:sdtContent>
@@ -401,7 +404,7 @@
             </w:rPr>
             <w:fldChar w:fldCharType="separate"/>
           </w:r>
-          <w:hyperlink w:anchor="_Toc230598084" w:history="1">
+          <w:hyperlink w:anchor="_Toc230618496" w:history="1">
             <w:r>
               <w:rPr>
                 <w:rStyle w:val="ad"/>
@@ -442,7 +445,7 @@
                 <w:sz w:val="28"/>
                 <w:szCs w:val="28"/>
               </w:rPr>
-              <w:instrText xml:space="preserve"> PAGEREF _Toc230598084 \h </w:instrText>
+              <w:instrText xml:space="preserve"> PAGEREF _Toc230618496 \h </w:instrText>
             </w:r>
             <w:r>
               <w:rPr>
@@ -499,7 +502,7 @@
               <w:szCs w:val="28"/>
             </w:rPr>
           </w:pPr>
-          <w:hyperlink w:anchor="_Toc230598085" w:history="1">
+          <w:hyperlink w:anchor="_Toc230618497" w:history="1">
             <w:r>
               <w:rPr>
                 <w:rStyle w:val="ad"/>
@@ -561,7 +564,7 @@
                 <w:sz w:val="28"/>
                 <w:szCs w:val="28"/>
               </w:rPr>
-              <w:instrText xml:space="preserve"> PAGEREF _Toc230598085 \h </w:instrText>
+              <w:instrText xml:space="preserve"> PAGEREF _Toc230618497 \h </w:instrText>
             </w:r>
             <w:r>
               <w:rPr>
@@ -618,7 +621,7 @@
               <w:szCs w:val="28"/>
             </w:rPr>
           </w:pPr>
-          <w:hyperlink w:anchor="_Toc230598086" w:history="1">
+          <w:hyperlink w:anchor="_Toc230618498" w:history="1">
             <w:r>
               <w:rPr>
                 <w:rStyle w:val="ad"/>
@@ -680,7 +683,7 @@
                 <w:sz w:val="28"/>
                 <w:szCs w:val="28"/>
               </w:rPr>
-              <w:instrText xml:space="preserve"> PAGEREF _Toc230598086 \h </w:instrText>
+              <w:instrText xml:space="preserve"> PAGEREF _Toc230618498 \h </w:instrText>
             </w:r>
             <w:r>
               <w:rPr>
@@ -737,7 +740,7 @@
               <w:szCs w:val="28"/>
             </w:rPr>
           </w:pPr>
-          <w:hyperlink w:anchor="_Toc230598087" w:history="1">
+          <w:hyperlink w:anchor="_Toc230618499" w:history="1">
             <w:r>
               <w:rPr>
                 <w:rStyle w:val="ad"/>
@@ -799,7 +802,7 @@
                 <w:sz w:val="28"/>
                 <w:szCs w:val="28"/>
               </w:rPr>
-              <w:instrText xml:space="preserve"> PAGEREF _Toc230598087 \h </w:instrText>
+              <w:instrText xml:space="preserve"> PAGEREF _Toc230618499 \h </w:instrText>
             </w:r>
             <w:r>
               <w:rPr>
@@ -856,7 +859,7 @@
               <w:szCs w:val="28"/>
             </w:rPr>
           </w:pPr>
-          <w:hyperlink w:anchor="_Toc230598088" w:history="1">
+          <w:hyperlink w:anchor="_Toc230618500" w:history="1">
             <w:r>
               <w:rPr>
                 <w:rStyle w:val="ad"/>
@@ -918,7 +921,7 @@
                 <w:sz w:val="28"/>
                 <w:szCs w:val="28"/>
               </w:rPr>
-              <w:instrText xml:space="preserve"> PAGEREF _Toc230598088 \h </w:instrText>
+              <w:instrText xml:space="preserve"> PAGEREF _Toc230618500 \h </w:instrText>
             </w:r>
             <w:r>
               <w:rPr>
@@ -975,7 +978,7 @@
               <w:szCs w:val="28"/>
             </w:rPr>
           </w:pPr>
-          <w:hyperlink w:anchor="_Toc230598089" w:history="1">
+          <w:hyperlink w:anchor="_Toc230618501" w:history="1">
             <w:r>
               <w:rPr>
                 <w:rStyle w:val="ad"/>
@@ -1037,7 +1040,7 @@
                 <w:sz w:val="28"/>
                 <w:szCs w:val="28"/>
               </w:rPr>
-              <w:instrText xml:space="preserve"> PAGEREF _Toc230598089 \h </w:instrText>
+              <w:instrText xml:space="preserve"> PAGEREF _Toc230618501 \h </w:instrText>
             </w:r>
             <w:r>
               <w:rPr>
@@ -1094,7 +1097,7 @@
               <w:szCs w:val="28"/>
             </w:rPr>
           </w:pPr>
-          <w:hyperlink w:anchor="_Toc230598090" w:history="1">
+          <w:hyperlink w:anchor="_Toc230618502" w:history="1">
             <w:r>
               <w:rPr>
                 <w:rStyle w:val="ad"/>
@@ -1156,7 +1159,7 @@
                 <w:sz w:val="28"/>
                 <w:szCs w:val="28"/>
               </w:rPr>
-              <w:instrText xml:space="preserve"> PAGEREF _Toc230598090 \h </w:instrText>
+              <w:instrText xml:space="preserve"> PAGEREF _Toc230618502 \h </w:instrText>
             </w:r>
             <w:r>
               <w:rPr>
@@ -1213,7 +1216,7 @@
               <w:szCs w:val="28"/>
             </w:rPr>
           </w:pPr>
-          <w:hyperlink w:anchor="_Toc230598091" w:history="1">
+          <w:hyperlink w:anchor="_Toc230618503" w:history="1">
             <w:r>
               <w:rPr>
                 <w:rStyle w:val="ad"/>
@@ -1275,7 +1278,7 @@
                 <w:sz w:val="28"/>
                 <w:szCs w:val="28"/>
               </w:rPr>
-              <w:instrText xml:space="preserve"> PAGEREF _Toc230598091 \h </w:instrText>
+              <w:instrText xml:space="preserve"> PAGEREF _Toc230618503 \h </w:instrText>
             </w:r>
             <w:r>
               <w:rPr>
@@ -1332,7 +1335,7 @@
               <w:szCs w:val="28"/>
             </w:rPr>
           </w:pPr>
-          <w:hyperlink w:anchor="_Toc230598092" w:history="1">
+          <w:hyperlink w:anchor="_Toc230618504" w:history="1">
             <w:r>
               <w:rPr>
                 <w:rStyle w:val="ad"/>
@@ -1394,7 +1397,7 @@
                 <w:sz w:val="28"/>
                 <w:szCs w:val="28"/>
               </w:rPr>
-              <w:instrText xml:space="preserve"> PAGEREF _Toc230598092 \h </w:instrText>
+              <w:instrText xml:space="preserve"> PAGEREF _Toc230618504 \h </w:instrText>
             </w:r>
             <w:r>
               <w:rPr>
@@ -1451,7 +1454,7 @@
               <w:szCs w:val="28"/>
             </w:rPr>
           </w:pPr>
-          <w:hyperlink w:anchor="_Toc230598093" w:history="1">
+          <w:hyperlink w:anchor="_Toc230618505" w:history="1">
             <w:r>
               <w:rPr>
                 <w:rStyle w:val="ad"/>
@@ -1513,7 +1516,7 @@
                 <w:sz w:val="28"/>
                 <w:szCs w:val="28"/>
               </w:rPr>
-              <w:instrText xml:space="preserve"> PAGEREF _Toc230598093 \h </w:instrText>
+              <w:instrText xml:space="preserve"> PAGEREF _Toc230618505 \h </w:instrText>
             </w:r>
             <w:r>
               <w:rPr>
@@ -1570,7 +1573,7 @@
               <w:szCs w:val="28"/>
             </w:rPr>
           </w:pPr>
-          <w:hyperlink w:anchor="_Toc230598094" w:history="1">
+          <w:hyperlink w:anchor="_Toc230618506" w:history="1">
             <w:r>
               <w:rPr>
                 <w:rStyle w:val="ad"/>
@@ -1632,7 +1635,7 @@
                 <w:sz w:val="28"/>
                 <w:szCs w:val="28"/>
               </w:rPr>
-              <w:instrText xml:space="preserve"> PAGEREF _Toc230598094 \h </w:instrText>
+              <w:instrText xml:space="preserve"> PAGEREF _Toc230618506 \h </w:instrText>
             </w:r>
             <w:r>
               <w:rPr>
@@ -1689,7 +1692,7 @@
               <w:szCs w:val="28"/>
             </w:rPr>
           </w:pPr>
-          <w:hyperlink w:anchor="_Toc230598095" w:history="1">
+          <w:hyperlink w:anchor="_Toc230618507" w:history="1">
             <w:r>
               <w:rPr>
                 <w:rStyle w:val="ad"/>
@@ -1751,7 +1754,7 @@
                 <w:sz w:val="28"/>
                 <w:szCs w:val="28"/>
               </w:rPr>
-              <w:instrText xml:space="preserve"> PAGEREF _Toc230598095 \h </w:instrText>
+              <w:instrText xml:space="preserve"> PAGEREF _Toc230618507 \h </w:instrText>
             </w:r>
             <w:r>
               <w:rPr>
@@ -1808,7 +1811,7 @@
               <w:szCs w:val="28"/>
             </w:rPr>
           </w:pPr>
-          <w:hyperlink w:anchor="_Toc230598096" w:history="1">
+          <w:hyperlink w:anchor="_Toc230618508" w:history="1">
             <w:r>
               <w:rPr>
                 <w:rStyle w:val="ad"/>
@@ -1870,7 +1873,7 @@
                 <w:sz w:val="28"/>
                 <w:szCs w:val="28"/>
               </w:rPr>
-              <w:instrText xml:space="preserve"> PAGEREF _Toc230598096 \h </w:instrText>
+              <w:instrText xml:space="preserve"> PAGEREF _Toc230618508 \h </w:instrText>
             </w:r>
             <w:r>
               <w:rPr>
@@ -1927,7 +1930,7 @@
               <w:szCs w:val="28"/>
             </w:rPr>
           </w:pPr>
-          <w:hyperlink w:anchor="_Toc230598097" w:history="1">
+          <w:hyperlink w:anchor="_Toc230618509" w:history="1">
             <w:r>
               <w:rPr>
                 <w:rStyle w:val="ad"/>
@@ -1989,7 +1992,7 @@
                 <w:sz w:val="28"/>
                 <w:szCs w:val="28"/>
               </w:rPr>
-              <w:instrText xml:space="preserve"> PAGEREF _Toc230598097 \h </w:instrText>
+              <w:instrText xml:space="preserve"> PAGEREF _Toc230618509 \h </w:instrText>
             </w:r>
             <w:r>
               <w:rPr>
@@ -2046,7 +2049,7 @@
               <w:szCs w:val="28"/>
             </w:rPr>
           </w:pPr>
-          <w:hyperlink w:anchor="_Toc230598098" w:history="1">
+          <w:hyperlink w:anchor="_Toc230618510" w:history="1">
             <w:r>
               <w:rPr>
                 <w:rStyle w:val="ad"/>
@@ -2108,7 +2111,7 @@
                 <w:sz w:val="28"/>
                 <w:szCs w:val="28"/>
               </w:rPr>
-              <w:instrText xml:space="preserve"> PAGEREF _Toc230598098 \h </w:instrText>
+              <w:instrText xml:space="preserve"> PAGEREF _Toc230618510 \h </w:instrText>
             </w:r>
             <w:r>
               <w:rPr>
@@ -2165,7 +2168,7 @@
               <w:szCs w:val="28"/>
             </w:rPr>
           </w:pPr>
-          <w:hyperlink w:anchor="_Toc230598099" w:history="1">
+          <w:hyperlink w:anchor="_Toc230618511" w:history="1">
             <w:r>
               <w:rPr>
                 <w:rStyle w:val="ad"/>
@@ -2227,7 +2230,7 @@
                 <w:sz w:val="28"/>
                 <w:szCs w:val="28"/>
               </w:rPr>
-              <w:instrText xml:space="preserve"> PAGEREF _Toc230598099 \h </w:instrText>
+              <w:instrText xml:space="preserve"> PAGEREF _Toc230618511 \h </w:instrText>
             </w:r>
             <w:r>
               <w:rPr>
@@ -2284,7 +2287,7 @@
               <w:szCs w:val="28"/>
             </w:rPr>
           </w:pPr>
-          <w:hyperlink w:anchor="_Toc230598100" w:history="1">
+          <w:hyperlink w:anchor="_Toc230618512" w:history="1">
             <w:r>
               <w:rPr>
                 <w:rStyle w:val="ad"/>
@@ -2346,7 +2349,7 @@
                 <w:sz w:val="28"/>
                 <w:szCs w:val="28"/>
               </w:rPr>
-              <w:instrText xml:space="preserve"> PAGEREF _Toc230598100 \h </w:instrText>
+              <w:instrText xml:space="preserve"> PAGEREF _Toc230618512 \h </w:instrText>
             </w:r>
             <w:r>
               <w:rPr>
@@ -2403,7 +2406,7 @@
               <w:szCs w:val="28"/>
             </w:rPr>
           </w:pPr>
-          <w:hyperlink w:anchor="_Toc230598101" w:history="1">
+          <w:hyperlink w:anchor="_Toc230618513" w:history="1">
             <w:r>
               <w:rPr>
                 <w:rStyle w:val="ad"/>
@@ -2465,7 +2468,7 @@
                 <w:sz w:val="28"/>
                 <w:szCs w:val="28"/>
               </w:rPr>
-              <w:instrText xml:space="preserve"> PAGEREF _Toc230598101 \h </w:instrText>
+              <w:instrText xml:space="preserve"> PAGEREF _Toc230618513 \h </w:instrText>
             </w:r>
             <w:r>
               <w:rPr>
@@ -2522,7 +2525,7 @@
               <w:szCs w:val="28"/>
             </w:rPr>
           </w:pPr>
-          <w:hyperlink w:anchor="_Toc230598102" w:history="1">
+          <w:hyperlink w:anchor="_Toc230618514" w:history="1">
             <w:r>
               <w:rPr>
                 <w:rStyle w:val="ad"/>
@@ -2584,7 +2587,7 @@
                 <w:sz w:val="28"/>
                 <w:szCs w:val="28"/>
               </w:rPr>
-              <w:instrText xml:space="preserve"> PAGEREF _Toc230598102 \h </w:instrText>
+              <w:instrText xml:space="preserve"> PAGEREF _Toc230618514 \h </w:instrText>
             </w:r>
             <w:r>
               <w:rPr>
@@ -2641,7 +2644,7 @@
               <w:szCs w:val="28"/>
             </w:rPr>
           </w:pPr>
-          <w:hyperlink w:anchor="_Toc230598103" w:history="1">
+          <w:hyperlink w:anchor="_Toc230618515" w:history="1">
             <w:r>
               <w:rPr>
                 <w:rStyle w:val="ad"/>
@@ -2703,7 +2706,7 @@
                 <w:sz w:val="28"/>
                 <w:szCs w:val="28"/>
               </w:rPr>
-              <w:instrText xml:space="preserve"> PAGEREF _Toc230598103 \h </w:instrText>
+              <w:instrText xml:space="preserve"> PAGEREF _Toc230618515 \h </w:instrText>
             </w:r>
             <w:r>
               <w:rPr>
@@ -2748,124 +2751,12 @@
         </w:p>
         <w:p>
           <w:pPr>
-            <w:pStyle w:val="23"/>
-            <w:tabs>
-              <w:tab w:val="left" w:pos="960"/>
-              <w:tab w:val="right" w:leader="dot" w:pos="9345"/>
-            </w:tabs>
             <w:rPr>
               <w:rFonts w:ascii="Times New Roman" w:hAnsi="Times New Roman" w:cs="Times New Roman"/>
-              <w:noProof/>
               <w:sz w:val="28"/>
               <w:szCs w:val="28"/>
             </w:rPr>
           </w:pPr>
-          <w:hyperlink w:anchor="_Toc230598104" w:history="1">
-            <w:r>
-              <w:rPr>
-                <w:rStyle w:val="ad"/>
-                <w:rFonts w:ascii="Times New Roman" w:hAnsi="Times New Roman" w:cs="Times New Roman"/>
-                <w:b/>
-                <w:bCs/>
-                <w:noProof/>
-                <w:sz w:val="28"/>
-                <w:szCs w:val="28"/>
-              </w:rPr>
-              <w:t>4.4.</w:t>
-            </w:r>
-            <w:r>
-              <w:rPr>
-                <w:rFonts w:ascii="Times New Roman" w:hAnsi="Times New Roman" w:cs="Times New Roman"/>
-                <w:noProof/>
-                <w:sz w:val="28"/>
-                <w:szCs w:val="28"/>
-              </w:rPr>
-              <w:tab/>
-            </w:r>
-            <w:r>
-              <w:rPr>
-                <w:rStyle w:val="ad"/>
-                <w:rFonts w:ascii="Times New Roman" w:hAnsi="Times New Roman" w:cs="Times New Roman"/>
-                <w:b/>
-                <w:bCs/>
-                <w:noProof/>
-                <w:sz w:val="28"/>
-                <w:szCs w:val="28"/>
-              </w:rPr>
-              <w:t>Планирование работ и диаграмма Ганта</w:t>
-            </w:r>
-            <w:r>
-              <w:rPr>
-                <w:rFonts w:ascii="Times New Roman" w:hAnsi="Times New Roman" w:cs="Times New Roman"/>
-                <w:noProof/>
-                <w:webHidden/>
-                <w:sz w:val="28"/>
-                <w:szCs w:val="28"/>
-              </w:rPr>
-              <w:tab/>
-            </w:r>
-            <w:r>
-              <w:rPr>
-                <w:rFonts w:ascii="Times New Roman" w:hAnsi="Times New Roman" w:cs="Times New Roman"/>
-                <w:noProof/>
-                <w:webHidden/>
-                <w:sz w:val="28"/>
-                <w:szCs w:val="28"/>
-              </w:rPr>
-              <w:fldChar w:fldCharType="begin"/>
-            </w:r>
-            <w:r>
-              <w:rPr>
-                <w:rFonts w:ascii="Times New Roman" w:hAnsi="Times New Roman" w:cs="Times New Roman"/>
-                <w:noProof/>
-                <w:webHidden/>
-                <w:sz w:val="28"/>
-                <w:szCs w:val="28"/>
-              </w:rPr>
-              <w:instrText xml:space="preserve"> PAGEREF _Toc230598104 \h </w:instrText>
-            </w:r>
-            <w:r>
-              <w:rPr>
-                <w:rFonts w:ascii="Times New Roman" w:hAnsi="Times New Roman" w:cs="Times New Roman"/>
-                <w:noProof/>
-                <w:webHidden/>
-                <w:sz w:val="28"/>
-                <w:szCs w:val="28"/>
-              </w:rPr>
-            </w:r>
-            <w:r>
-              <w:rPr>
-                <w:rFonts w:ascii="Times New Roman" w:hAnsi="Times New Roman" w:cs="Times New Roman"/>
-                <w:noProof/>
-                <w:webHidden/>
-                <w:sz w:val="28"/>
-                <w:szCs w:val="28"/>
-              </w:rPr>
-              <w:fldChar w:fldCharType="separate"/>
-            </w:r>
-            <w:r>
-              <w:rPr>
-                <w:rFonts w:ascii="Times New Roman" w:hAnsi="Times New Roman" w:cs="Times New Roman"/>
-                <w:noProof/>
-                <w:webHidden/>
-                <w:sz w:val="28"/>
-                <w:szCs w:val="28"/>
-              </w:rPr>
-              <w:t>33</w:t>
-            </w:r>
-            <w:r>
-              <w:rPr>
-                <w:rFonts w:ascii="Times New Roman" w:hAnsi="Times New Roman" w:cs="Times New Roman"/>
-                <w:noProof/>
-                <w:webHidden/>
-                <w:sz w:val="28"/>
-                <w:szCs w:val="28"/>
-              </w:rPr>
-              <w:fldChar w:fldCharType="end"/>
-            </w:r>
-          </w:hyperlink>
-        </w:p>
-        <w:p>
           <w:r>
             <w:rPr>
               <w:rFonts w:ascii="Times New Roman" w:hAnsi="Times New Roman" w:cs="Times New Roman"/>
@@ -2990,7 +2881,7 @@
           <w:szCs w:val="28"/>
         </w:rPr>
       </w:pPr>
-      <w:bookmarkStart w:id="0" w:name="_Toc230598084"/>
+      <w:bookmarkStart w:id="0" w:name="_Toc230618496"/>
       <w:r>
         <w:rPr>
           <w:rFonts w:ascii="Times New Roman" w:hAnsi="Times New Roman" w:cs="Times New Roman"/>
@@ -3828,7 +3719,7 @@
           <w:szCs w:val="28"/>
         </w:rPr>
       </w:pPr>
-      <w:bookmarkStart w:id="1" w:name="_Toc230598085"/>
+      <w:bookmarkStart w:id="1" w:name="_Toc230618497"/>
       <w:r>
         <w:rPr>
           <w:rFonts w:ascii="Times New Roman" w:hAnsi="Times New Roman" w:cs="Times New Roman"/>
@@ -3862,7 +3753,7 @@
           <w:szCs w:val="28"/>
         </w:rPr>
       </w:pPr>
-      <w:bookmarkStart w:id="2" w:name="_Toc230598086"/>
+      <w:bookmarkStart w:id="2" w:name="_Toc230618498"/>
       <w:r>
         <w:rPr>
           <w:rFonts w:ascii="Times New Roman" w:hAnsi="Times New Roman" w:cs="Times New Roman"/>
@@ -4052,7 +3943,7 @@
           <w:szCs w:val="28"/>
         </w:rPr>
       </w:pPr>
-      <w:bookmarkStart w:id="3" w:name="_Toc230598087"/>
+      <w:bookmarkStart w:id="3" w:name="_Toc230618499"/>
       <w:r>
         <w:rPr>
           <w:rFonts w:ascii="Times New Roman" w:hAnsi="Times New Roman" w:cs="Times New Roman"/>
@@ -4516,7 +4407,7 @@
           <w:szCs w:val="28"/>
         </w:rPr>
       </w:pPr>
-      <w:bookmarkStart w:id="4" w:name="_Toc230598088"/>
+      <w:bookmarkStart w:id="4" w:name="_Toc230618500"/>
       <w:r>
         <w:rPr>
           <w:rFonts w:ascii="Times New Roman" w:hAnsi="Times New Roman" w:cs="Times New Roman"/>
@@ -4779,7 +4670,7 @@
           <w:szCs w:val="28"/>
         </w:rPr>
       </w:pPr>
-      <w:bookmarkStart w:id="5" w:name="_Toc230598089"/>
+      <w:bookmarkStart w:id="5" w:name="_Toc230618501"/>
       <w:r>
         <w:rPr>
           <w:rFonts w:ascii="Times New Roman" w:hAnsi="Times New Roman" w:cs="Times New Roman"/>
@@ -5347,7 +5238,7 @@
           <w:szCs w:val="28"/>
         </w:rPr>
       </w:pPr>
-      <w:bookmarkStart w:id="6" w:name="_Toc230598090"/>
+      <w:bookmarkStart w:id="6" w:name="_Toc230618502"/>
       <w:r>
         <w:rPr>
           <w:rFonts w:ascii="Times New Roman" w:hAnsi="Times New Roman" w:cs="Times New Roman"/>
@@ -5675,7 +5566,7 @@
           <w:szCs w:val="28"/>
         </w:rPr>
       </w:pPr>
-      <w:bookmarkStart w:id="7" w:name="_Toc230598091"/>
+      <w:bookmarkStart w:id="7" w:name="_Toc230618503"/>
       <w:r>
         <w:rPr>
           <w:rFonts w:ascii="Times New Roman" w:hAnsi="Times New Roman" w:cs="Times New Roman"/>
@@ -5709,7 +5600,7 @@
           <w:szCs w:val="28"/>
         </w:rPr>
       </w:pPr>
-      <w:bookmarkStart w:id="8" w:name="_Toc230598092"/>
+      <w:bookmarkStart w:id="8" w:name="_Toc230618504"/>
       <w:r>
         <w:rPr>
           <w:rFonts w:ascii="Times New Roman" w:hAnsi="Times New Roman" w:cs="Times New Roman"/>
@@ -5954,7 +5845,7 @@
           <w:szCs w:val="28"/>
         </w:rPr>
       </w:pPr>
-      <w:bookmarkStart w:id="9" w:name="_Toc230598093"/>
+      <w:bookmarkStart w:id="9" w:name="_Toc230618505"/>
       <w:r>
         <w:rPr>
           <w:rFonts w:ascii="Times New Roman" w:hAnsi="Times New Roman" w:cs="Times New Roman"/>
@@ -6969,7 +6860,7 @@
           <w:szCs w:val="28"/>
         </w:rPr>
       </w:pPr>
-      <w:bookmarkStart w:id="10" w:name="_Toc230598094"/>
+      <w:bookmarkStart w:id="10" w:name="_Toc230618506"/>
       <w:r>
         <w:rPr>
           <w:rFonts w:ascii="Times New Roman" w:hAnsi="Times New Roman" w:cs="Times New Roman"/>
@@ -7665,7 +7556,7 @@
           <w:szCs w:val="28"/>
         </w:rPr>
       </w:pPr>
-      <w:bookmarkStart w:id="11" w:name="_Toc230598095"/>
+      <w:bookmarkStart w:id="11" w:name="_Toc230618507"/>
       <w:r>
         <w:rPr>
           <w:rFonts w:ascii="Times New Roman" w:hAnsi="Times New Roman" w:cs="Times New Roman"/>
@@ -7699,7 +7590,7 @@
           <w:szCs w:val="28"/>
         </w:rPr>
       </w:pPr>
-      <w:bookmarkStart w:id="12" w:name="_Toc230598096"/>
+      <w:bookmarkStart w:id="12" w:name="_Toc230618508"/>
       <w:r>
         <w:rPr>
           <w:rFonts w:ascii="Times New Roman" w:hAnsi="Times New Roman" w:cs="Times New Roman"/>
@@ -7895,7 +7786,7 @@
           <w:szCs w:val="28"/>
         </w:rPr>
       </w:pPr>
-      <w:bookmarkStart w:id="13" w:name="_Toc230598097"/>
+      <w:bookmarkStart w:id="13" w:name="_Toc230618509"/>
       <w:r>
         <w:rPr>
           <w:rFonts w:ascii="Times New Roman" w:hAnsi="Times New Roman" w:cs="Times New Roman"/>
@@ -7968,7 +7859,7 @@
           <w:szCs w:val="28"/>
         </w:rPr>
       </w:pPr>
-      <w:bookmarkStart w:id="14" w:name="_Toc230598098"/>
+      <w:bookmarkStart w:id="14" w:name="_Toc230618510"/>
       <w:r>
         <w:rPr>
           <w:rFonts w:ascii="Times New Roman" w:hAnsi="Times New Roman" w:cs="Times New Roman"/>
@@ -9076,7 +8967,7 @@
           <w:szCs w:val="28"/>
         </w:rPr>
       </w:pPr>
-      <w:bookmarkStart w:id="15" w:name="_Toc230598099"/>
+      <w:bookmarkStart w:id="15" w:name="_Toc230618511"/>
       <w:r>
         <w:rPr>
           <w:rFonts w:ascii="Times New Roman" w:hAnsi="Times New Roman" w:cs="Times New Roman"/>
@@ -9512,7 +9403,7 @@
           <w:szCs w:val="28"/>
         </w:rPr>
       </w:pPr>
-      <w:bookmarkStart w:id="16" w:name="_Toc230598100"/>
+      <w:bookmarkStart w:id="16" w:name="_Toc230618512"/>
       <w:r>
         <w:rPr>
           <w:rFonts w:ascii="Times New Roman" w:hAnsi="Times New Roman" w:cs="Times New Roman"/>
@@ -9546,7 +9437,7 @@
           <w:szCs w:val="28"/>
         </w:rPr>
       </w:pPr>
-      <w:bookmarkStart w:id="17" w:name="_Toc230598101"/>
+      <w:bookmarkStart w:id="17" w:name="_Toc230618513"/>
       <w:r>
         <w:rPr>
           <w:rFonts w:ascii="Times New Roman" w:hAnsi="Times New Roman" w:cs="Times New Roman"/>
@@ -9918,7 +9809,7 @@
           <w:szCs w:val="28"/>
         </w:rPr>
       </w:pPr>
-      <w:bookmarkStart w:id="18" w:name="_Toc230598102"/>
+      <w:bookmarkStart w:id="18" w:name="_Toc230618514"/>
       <w:r>
         <w:rPr>
           <w:rFonts w:ascii="Times New Roman" w:hAnsi="Times New Roman" w:cs="Times New Roman"/>
@@ -12619,7 +12510,7 @@
           <w:szCs w:val="28"/>
         </w:rPr>
       </w:pPr>
-      <w:bookmarkStart w:id="19" w:name="_Toc230598103"/>
+      <w:bookmarkStart w:id="19" w:name="_Toc230618515"/>
       <w:r>
         <w:rPr>
           <w:rFonts w:ascii="Times New Roman" w:hAnsi="Times New Roman" w:cs="Times New Roman"/>
@@ -12935,447 +12826,6 @@
           <w:szCs w:val="28"/>
         </w:rPr>
         <w:t xml:space="preserve"> около 8%. Обучение пользователей и внедрение в совокупности составляют около 5%.</w:t>
-      </w:r>
-    </w:p>
-    <w:p>
-      <w:pPr>
-        <w:pStyle w:val="a7"/>
-        <w:numPr>
-          <w:ilvl w:val="1"/>
-          <w:numId w:val="26"/>
-        </w:numPr>
-        <w:spacing w:before="240" w:after="120" w:line="360" w:lineRule="auto"/>
-        <w:ind w:left="0" w:firstLine="709"/>
-        <w:jc w:val="both"/>
-        <w:outlineLvl w:val="1"/>
-        <w:rPr>
-          <w:rFonts w:ascii="Times New Roman" w:hAnsi="Times New Roman" w:cs="Times New Roman"/>
-          <w:b/>
-          <w:bCs/>
-          <w:sz w:val="28"/>
-          <w:szCs w:val="28"/>
-        </w:rPr>
-      </w:pPr>
-      <w:bookmarkStart w:id="20" w:name="_Toc230598104"/>
-      <w:r>
-        <w:rPr>
-          <w:rFonts w:ascii="Times New Roman" w:hAnsi="Times New Roman" w:cs="Times New Roman"/>
-          <w:b/>
-          <w:bCs/>
-          <w:sz w:val="28"/>
-          <w:szCs w:val="28"/>
-        </w:rPr>
-        <w:t xml:space="preserve">Планирование работ и диаграмма </w:t>
-      </w:r>
-      <w:proofErr w:type="spellStart"/>
-      <w:r>
-        <w:rPr>
-          <w:rFonts w:ascii="Times New Roman" w:hAnsi="Times New Roman" w:cs="Times New Roman"/>
-          <w:b/>
-          <w:bCs/>
-          <w:sz w:val="28"/>
-          <w:szCs w:val="28"/>
-        </w:rPr>
-        <w:t>Ганта</w:t>
-      </w:r>
-      <w:bookmarkEnd w:id="20"/>
-      <w:proofErr w:type="spellEnd"/>
-    </w:p>
-    <w:p>
-      <w:pPr>
-        <w:spacing w:after="0" w:line="360" w:lineRule="auto"/>
-        <w:ind w:firstLine="709"/>
-        <w:jc w:val="both"/>
-        <w:rPr>
-          <w:rFonts w:ascii="Times New Roman" w:hAnsi="Times New Roman" w:cs="Times New Roman"/>
-          <w:sz w:val="28"/>
-          <w:szCs w:val="28"/>
-        </w:rPr>
-      </w:pPr>
-      <w:r>
-        <w:rPr>
-          <w:rFonts w:ascii="Times New Roman" w:hAnsi="Times New Roman" w:cs="Times New Roman"/>
-          <w:sz w:val="28"/>
-          <w:szCs w:val="28"/>
-        </w:rPr>
-        <w:t xml:space="preserve">Диаграмма </w:t>
-      </w:r>
-      <w:proofErr w:type="spellStart"/>
-      <w:r>
-        <w:rPr>
-          <w:rFonts w:ascii="Times New Roman" w:hAnsi="Times New Roman" w:cs="Times New Roman"/>
-          <w:sz w:val="28"/>
-          <w:szCs w:val="28"/>
-        </w:rPr>
-        <w:t>Ганта</w:t>
-      </w:r>
-      <w:proofErr w:type="spellEnd"/>
-      <w:r>
-        <w:rPr>
-          <w:rFonts w:ascii="Times New Roman" w:hAnsi="Times New Roman" w:cs="Times New Roman"/>
-          <w:sz w:val="28"/>
-          <w:szCs w:val="28"/>
-        </w:rPr>
-        <w:t xml:space="preserve"> строится на основе ожидаемых оценок трудозатрат с учётом последовательности и параллельности работ, а также загрузки исполнителей.</w:t>
-      </w:r>
-    </w:p>
-    <w:p>
-      <w:pPr>
-        <w:spacing w:after="0" w:line="360" w:lineRule="auto"/>
-        <w:ind w:firstLine="709"/>
-        <w:jc w:val="both"/>
-        <w:rPr>
-          <w:rFonts w:ascii="Times New Roman" w:hAnsi="Times New Roman" w:cs="Times New Roman"/>
-          <w:sz w:val="28"/>
-          <w:szCs w:val="28"/>
-        </w:rPr>
-      </w:pPr>
-      <w:r>
-        <w:rPr>
-          <w:rFonts w:ascii="Times New Roman" w:hAnsi="Times New Roman" w:cs="Times New Roman"/>
-          <w:sz w:val="28"/>
-          <w:szCs w:val="28"/>
-        </w:rPr>
-        <w:t>При планировании расписания проекта необходимо учитывать зависимости между задачами. Модуль авторизации (ТР1) является блокирующим для всех остальных модулей: пока не реализована система ролей, невозможно корректно разграничить доступ ни в одном другом модуле. Поэтому разработка авторизации выполняется в первую очередь, до начала работ по всем остальным функциональным блокам.</w:t>
-      </w:r>
-    </w:p>
-    <w:p>
-      <w:pPr>
-        <w:spacing w:after="0" w:line="360" w:lineRule="auto"/>
-        <w:ind w:firstLine="709"/>
-        <w:jc w:val="both"/>
-        <w:rPr>
-          <w:rFonts w:ascii="Times New Roman" w:hAnsi="Times New Roman" w:cs="Times New Roman"/>
-          <w:sz w:val="28"/>
-          <w:szCs w:val="28"/>
-        </w:rPr>
-      </w:pPr>
-      <w:r>
-        <w:rPr>
-          <w:rFonts w:ascii="Times New Roman" w:hAnsi="Times New Roman" w:cs="Times New Roman"/>
-          <w:sz w:val="28"/>
-          <w:szCs w:val="28"/>
-        </w:rPr>
-        <w:t>Серверная часть</w:t>
-      </w:r>
-      <w:r>
-        <w:rPr>
-          <w:rFonts w:ascii="Times New Roman" w:hAnsi="Times New Roman" w:cs="Times New Roman"/>
-          <w:sz w:val="28"/>
-          <w:szCs w:val="28"/>
-        </w:rPr>
-        <w:t xml:space="preserve"> </w:t>
-      </w:r>
-      <w:r>
-        <w:rPr>
-          <w:rFonts w:ascii="Times New Roman" w:hAnsi="Times New Roman" w:cs="Times New Roman"/>
-          <w:sz w:val="28"/>
-          <w:szCs w:val="28"/>
-        </w:rPr>
-        <w:t>разрабатывается параллельно с клиентской частью</w:t>
-      </w:r>
-      <w:r>
-        <w:rPr>
-          <w:rFonts w:ascii="Times New Roman" w:hAnsi="Times New Roman" w:cs="Times New Roman"/>
-          <w:sz w:val="28"/>
-          <w:szCs w:val="28"/>
-        </w:rPr>
-        <w:t xml:space="preserve"> </w:t>
-      </w:r>
-      <w:r>
-        <w:rPr>
-          <w:rFonts w:ascii="Times New Roman" w:hAnsi="Times New Roman" w:cs="Times New Roman"/>
-          <w:sz w:val="28"/>
-          <w:szCs w:val="28"/>
-        </w:rPr>
-        <w:t xml:space="preserve">после завершения проектирования структуры базы данных. Такой подход позволяет двум разработчикам работать независимо: один реализует серверную логику, другой </w:t>
-      </w:r>
-      <w:r>
-        <w:rPr>
-          <w:rFonts w:ascii="Times New Roman" w:hAnsi="Times New Roman" w:cs="Times New Roman"/>
-          <w:sz w:val="28"/>
-          <w:szCs w:val="28"/>
-        </w:rPr>
-        <w:t>—</w:t>
-      </w:r>
-      <w:r>
-        <w:rPr>
-          <w:rFonts w:ascii="Times New Roman" w:hAnsi="Times New Roman" w:cs="Times New Roman"/>
-          <w:sz w:val="28"/>
-          <w:szCs w:val="28"/>
-        </w:rPr>
-        <w:t xml:space="preserve"> пользовательский интерфейс, интеграция происходит по мере готовности обеих частей.</w:t>
-      </w:r>
-    </w:p>
-    <w:p>
-      <w:pPr>
-        <w:spacing w:after="0" w:line="360" w:lineRule="auto"/>
-        <w:ind w:firstLine="709"/>
-        <w:jc w:val="both"/>
-        <w:rPr>
-          <w:rFonts w:ascii="Times New Roman" w:hAnsi="Times New Roman" w:cs="Times New Roman"/>
-          <w:sz w:val="28"/>
-          <w:szCs w:val="28"/>
-        </w:rPr>
-      </w:pPr>
-      <w:r>
-        <w:rPr>
-          <w:rFonts w:ascii="Times New Roman" w:hAnsi="Times New Roman" w:cs="Times New Roman"/>
-          <w:sz w:val="28"/>
-          <w:szCs w:val="28"/>
-        </w:rPr>
-        <w:t xml:space="preserve">Тестирование начинается не после завершения разработки, а параллельно с ней: модульное тестирование ведётся непрерывно, интеграционное </w:t>
-      </w:r>
-      <w:r>
-        <w:rPr>
-          <w:rFonts w:ascii="Times New Roman" w:hAnsi="Times New Roman" w:cs="Times New Roman"/>
-          <w:sz w:val="28"/>
-          <w:szCs w:val="28"/>
-        </w:rPr>
-        <w:t>—</w:t>
-      </w:r>
-      <w:r>
-        <w:rPr>
-          <w:rFonts w:ascii="Times New Roman" w:hAnsi="Times New Roman" w:cs="Times New Roman"/>
-          <w:sz w:val="28"/>
-          <w:szCs w:val="28"/>
-        </w:rPr>
-        <w:t xml:space="preserve"> по мере готовности интегрируемых компонентов. Это позволяет выявлять дефекты на ранних стадиях, когда их исправление наименее затратно.</w:t>
-      </w:r>
-    </w:p>
-    <w:p>
-      <w:pPr>
-        <w:spacing w:after="0" w:line="360" w:lineRule="auto"/>
-        <w:ind w:firstLine="709"/>
-        <w:jc w:val="both"/>
-        <w:rPr>
-          <w:rFonts w:ascii="Times New Roman" w:hAnsi="Times New Roman" w:cs="Times New Roman"/>
-          <w:sz w:val="28"/>
-          <w:szCs w:val="28"/>
-        </w:rPr>
-      </w:pPr>
-      <w:r>
-        <w:rPr>
-          <w:rFonts w:ascii="Times New Roman" w:hAnsi="Times New Roman" w:cs="Times New Roman"/>
-          <w:sz w:val="28"/>
-          <w:szCs w:val="28"/>
-        </w:rPr>
-        <w:t xml:space="preserve">Документирование ведётся параллельно с разработкой и финализируется после завершения тестирования каждой версии. Руководство </w:t>
-      </w:r>
-      <w:r>
-        <w:rPr>
-          <w:rFonts w:ascii="Times New Roman" w:hAnsi="Times New Roman" w:cs="Times New Roman"/>
-          <w:sz w:val="28"/>
-          <w:szCs w:val="28"/>
-        </w:rPr>
-        <w:lastRenderedPageBreak/>
-        <w:t xml:space="preserve">пользователя v1.0 сдаётся одновременно с версией 1.0 приложения </w:t>
-      </w:r>
-      <w:r>
-        <w:rPr>
-          <w:rFonts w:ascii="Times New Roman" w:hAnsi="Times New Roman" w:cs="Times New Roman"/>
-          <w:sz w:val="28"/>
-          <w:szCs w:val="28"/>
-        </w:rPr>
-        <w:t>—</w:t>
-      </w:r>
-      <w:r>
-        <w:rPr>
-          <w:rFonts w:ascii="Times New Roman" w:hAnsi="Times New Roman" w:cs="Times New Roman"/>
-          <w:sz w:val="28"/>
-          <w:szCs w:val="28"/>
-        </w:rPr>
-        <w:t xml:space="preserve"> к 20.05.2026.</w:t>
-      </w:r>
-    </w:p>
-    <w:p>
-      <w:pPr>
-        <w:spacing w:after="0" w:line="360" w:lineRule="auto"/>
-        <w:ind w:firstLine="709"/>
-        <w:jc w:val="both"/>
-        <w:rPr>
-          <w:rFonts w:ascii="Times New Roman" w:hAnsi="Times New Roman" w:cs="Times New Roman"/>
-          <w:sz w:val="28"/>
-          <w:szCs w:val="28"/>
-        </w:rPr>
-      </w:pPr>
-      <w:r>
-        <w:rPr>
-          <w:rFonts w:ascii="Times New Roman" w:hAnsi="Times New Roman" w:cs="Times New Roman"/>
-          <w:sz w:val="28"/>
-          <w:szCs w:val="28"/>
-        </w:rPr>
-        <w:t>Работы по внедрению версии 1.0 начинаются сразу после её приёмки командой и завершаются до выхода версии 2.0. Обучение пользователей проводится после развёртывания системы и настройки учётных записей.</w:t>
-      </w:r>
-    </w:p>
-    <w:p>
-      <w:pPr>
-        <w:spacing w:after="0" w:line="360" w:lineRule="auto"/>
-        <w:ind w:firstLine="709"/>
-        <w:jc w:val="both"/>
-        <w:rPr>
-          <w:rFonts w:ascii="Times New Roman" w:hAnsi="Times New Roman" w:cs="Times New Roman"/>
-          <w:sz w:val="28"/>
-          <w:szCs w:val="28"/>
-        </w:rPr>
-      </w:pPr>
-      <w:r>
-        <w:rPr>
-          <w:rFonts w:ascii="Times New Roman" w:hAnsi="Times New Roman" w:cs="Times New Roman"/>
-          <w:sz w:val="28"/>
-          <w:szCs w:val="28"/>
-        </w:rPr>
-        <w:t>Критический путь проекта проходит через следующую последовательность работ: проектирование базы данных</w:t>
-      </w:r>
-      <w:r>
-        <w:rPr>
-          <w:rFonts w:ascii="Times New Roman" w:hAnsi="Times New Roman" w:cs="Times New Roman"/>
-          <w:sz w:val="28"/>
-          <w:szCs w:val="28"/>
-        </w:rPr>
-        <w:t>,</w:t>
-      </w:r>
-      <w:r>
-        <w:rPr>
-          <w:rFonts w:ascii="Times New Roman" w:hAnsi="Times New Roman" w:cs="Times New Roman"/>
-          <w:sz w:val="28"/>
-          <w:szCs w:val="28"/>
-        </w:rPr>
-        <w:t xml:space="preserve"> разработка серверной части</w:t>
-      </w:r>
-      <w:r>
-        <w:rPr>
-          <w:rFonts w:ascii="Times New Roman" w:hAnsi="Times New Roman" w:cs="Times New Roman"/>
-          <w:sz w:val="28"/>
-          <w:szCs w:val="28"/>
-        </w:rPr>
-        <w:t xml:space="preserve">, </w:t>
-      </w:r>
-      <w:r>
-        <w:rPr>
-          <w:rFonts w:ascii="Times New Roman" w:hAnsi="Times New Roman" w:cs="Times New Roman"/>
-          <w:sz w:val="28"/>
-          <w:szCs w:val="28"/>
-        </w:rPr>
-        <w:t>реализация модуля авторизации</w:t>
-      </w:r>
-      <w:r>
-        <w:rPr>
-          <w:rFonts w:ascii="Times New Roman" w:hAnsi="Times New Roman" w:cs="Times New Roman"/>
-          <w:sz w:val="28"/>
-          <w:szCs w:val="28"/>
-        </w:rPr>
-        <w:t>,</w:t>
-      </w:r>
-      <w:r>
-        <w:rPr>
-          <w:rFonts w:ascii="Times New Roman" w:hAnsi="Times New Roman" w:cs="Times New Roman"/>
-          <w:sz w:val="28"/>
-          <w:szCs w:val="28"/>
-        </w:rPr>
-        <w:t xml:space="preserve"> разработка модуля ввода данных</w:t>
-      </w:r>
-      <w:r>
-        <w:rPr>
-          <w:rFonts w:ascii="Times New Roman" w:hAnsi="Times New Roman" w:cs="Times New Roman"/>
-          <w:sz w:val="28"/>
-          <w:szCs w:val="28"/>
-        </w:rPr>
-        <w:t>,</w:t>
-      </w:r>
-      <w:r>
-        <w:rPr>
-          <w:rFonts w:ascii="Times New Roman" w:hAnsi="Times New Roman" w:cs="Times New Roman"/>
-          <w:sz w:val="28"/>
-          <w:szCs w:val="28"/>
-        </w:rPr>
-        <w:t xml:space="preserve"> разработка модуля синхронизации</w:t>
-      </w:r>
-      <w:r>
-        <w:rPr>
-          <w:rFonts w:ascii="Times New Roman" w:hAnsi="Times New Roman" w:cs="Times New Roman"/>
-          <w:sz w:val="28"/>
-          <w:szCs w:val="28"/>
-        </w:rPr>
-        <w:t>,</w:t>
-      </w:r>
-      <w:r>
-        <w:rPr>
-          <w:rFonts w:ascii="Times New Roman" w:hAnsi="Times New Roman" w:cs="Times New Roman"/>
-          <w:sz w:val="28"/>
-          <w:szCs w:val="28"/>
-        </w:rPr>
-        <w:t xml:space="preserve"> интеграционное тестирование</w:t>
-      </w:r>
-      <w:r>
-        <w:rPr>
-          <w:rFonts w:ascii="Times New Roman" w:hAnsi="Times New Roman" w:cs="Times New Roman"/>
-          <w:sz w:val="28"/>
-          <w:szCs w:val="28"/>
-        </w:rPr>
-        <w:t>,</w:t>
-      </w:r>
-      <w:r>
-        <w:rPr>
-          <w:rFonts w:ascii="Times New Roman" w:hAnsi="Times New Roman" w:cs="Times New Roman"/>
-          <w:sz w:val="28"/>
-          <w:szCs w:val="28"/>
-        </w:rPr>
-        <w:t xml:space="preserve"> приёмочное тестирование</w:t>
-      </w:r>
-      <w:r>
-        <w:rPr>
-          <w:rFonts w:ascii="Times New Roman" w:hAnsi="Times New Roman" w:cs="Times New Roman"/>
-          <w:sz w:val="28"/>
-          <w:szCs w:val="28"/>
-        </w:rPr>
-        <w:t>,</w:t>
-      </w:r>
-      <w:r>
-        <w:rPr>
-          <w:rFonts w:ascii="Times New Roman" w:hAnsi="Times New Roman" w:cs="Times New Roman"/>
-          <w:sz w:val="28"/>
-          <w:szCs w:val="28"/>
-        </w:rPr>
-        <w:t xml:space="preserve"> внедрение версии 1.0. Любая задержка на любом из этих этапов непосредственно сдвигает дату выпуска версии 1.0.</w:t>
-      </w:r>
-    </w:p>
-    <w:p>
-      <w:pPr>
-        <w:spacing w:after="0" w:line="360" w:lineRule="auto"/>
-        <w:ind w:firstLine="709"/>
-        <w:jc w:val="both"/>
-        <w:rPr>
-          <w:rFonts w:ascii="Times New Roman" w:hAnsi="Times New Roman" w:cs="Times New Roman"/>
-          <w:sz w:val="28"/>
-          <w:szCs w:val="28"/>
-        </w:rPr>
-      </w:pPr>
-      <w:r>
-        <w:rPr>
-          <w:rFonts w:ascii="Times New Roman" w:hAnsi="Times New Roman" w:cs="Times New Roman"/>
-          <w:sz w:val="28"/>
-          <w:szCs w:val="28"/>
-        </w:rPr>
-        <w:t xml:space="preserve">Построение полной диаграммы </w:t>
-      </w:r>
-      <w:proofErr w:type="spellStart"/>
-      <w:r>
-        <w:rPr>
-          <w:rFonts w:ascii="Times New Roman" w:hAnsi="Times New Roman" w:cs="Times New Roman"/>
-          <w:sz w:val="28"/>
-          <w:szCs w:val="28"/>
-        </w:rPr>
-        <w:t>Ганта</w:t>
-      </w:r>
-      <w:proofErr w:type="spellEnd"/>
-      <w:r>
-        <w:rPr>
-          <w:rFonts w:ascii="Times New Roman" w:hAnsi="Times New Roman" w:cs="Times New Roman"/>
-          <w:sz w:val="28"/>
-          <w:szCs w:val="28"/>
-        </w:rPr>
-        <w:t xml:space="preserve"> с отображением всех задач, зависимостей и назначений исполнителей выполнено в инструменте планирования и представлено в Приложении к настоящей пояснительной записке.</w:t>
       </w:r>
     </w:p>
     <w:sectPr>

</xml_diff>